<commit_message>
Adjusted Lab 5 Report
</commit_message>
<xml_diff>
--- a/Lab-5_Operational-Amplifiers/Lab-5_Operational-Amplifiers.docx
+++ b/Lab-5_Operational-Amplifiers/Lab-5_Operational-Amplifiers.docx
@@ -6405,19 +6405,7 @@
         <w:rPr>
           <w:rFonts w:cstheme="minorHAnsi"/>
         </w:rPr>
-        <w:t>0.5 V amplitude square wave with a 0.5 V offset from the Wavegen</w:t>
-      </w:r>
-      <w:r>
-        <w:rPr>
-          <w:rFonts w:cstheme="minorHAnsi"/>
-        </w:rPr>
-        <w:t xml:space="preserve"> </w:t>
-      </w:r>
-      <w:r>
-        <w:rPr>
-          <w:rFonts w:cstheme="minorHAnsi"/>
-        </w:rPr>
-        <w:t xml:space="preserve">determine the slew rate in V/us. </w:t>
+        <w:t xml:space="preserve">0.5 V amplitude square wave with a 0.5 V offset from the Wavegen determine the slew rate in V/us. </w:t>
       </w:r>
     </w:p>
     <w:p>
@@ -7019,11 +7007,11 @@
         <w:tblLook w:val="04A0" w:firstRow="1" w:lastRow="0" w:firstColumn="1" w:lastColumn="0" w:noHBand="0" w:noVBand="1"/>
       </w:tblPr>
       <w:tblGrid>
-        <w:gridCol w:w="3821"/>
+        <w:gridCol w:w="3818"/>
         <w:gridCol w:w="767"/>
-        <w:gridCol w:w="3350"/>
+        <w:gridCol w:w="3349"/>
         <w:gridCol w:w="1750"/>
-        <w:gridCol w:w="1246"/>
+        <w:gridCol w:w="1250"/>
       </w:tblGrid>
       <w:tr>
         <w:trPr>
@@ -7307,6 +7295,14 @@
                 <w:szCs w:val="28"/>
               </w:rPr>
             </w:pPr>
+            <w:r>
+              <w:rPr>
+                <w:rFonts w:ascii="Times New Roman" w:hAnsi="Times New Roman" w:cs="Times New Roman"/>
+                <w:sz w:val="28"/>
+                <w:szCs w:val="28"/>
+              </w:rPr>
+              <w:t>76.77</w:t>
+            </w:r>
           </w:p>
         </w:tc>
       </w:tr>
@@ -7430,6 +7426,14 @@
                 <w:szCs w:val="28"/>
               </w:rPr>
             </w:pPr>
+            <w:r>
+              <w:rPr>
+                <w:rFonts w:ascii="Times New Roman" w:hAnsi="Times New Roman" w:cs="Times New Roman"/>
+                <w:sz w:val="28"/>
+                <w:szCs w:val="28"/>
+              </w:rPr>
+              <w:t>88.61</w:t>
+            </w:r>
           </w:p>
         </w:tc>
       </w:tr>
@@ -7562,6 +7566,14 @@
                 <w:szCs w:val="28"/>
               </w:rPr>
             </w:pPr>
+            <w:r>
+              <w:rPr>
+                <w:rFonts w:ascii="Times New Roman" w:hAnsi="Times New Roman" w:cs="Times New Roman"/>
+                <w:sz w:val="28"/>
+                <w:szCs w:val="28"/>
+              </w:rPr>
+              <w:t>0.4420</w:t>
+            </w:r>
           </w:p>
         </w:tc>
       </w:tr>
@@ -7707,6 +7719,14 @@
                 <w:szCs w:val="28"/>
               </w:rPr>
             </w:pPr>
+            <w:r>
+              <w:rPr>
+                <w:rFonts w:ascii="Times New Roman" w:hAnsi="Times New Roman" w:cs="Times New Roman"/>
+                <w:sz w:val="28"/>
+                <w:szCs w:val="28"/>
+              </w:rPr>
+              <w:t>0.7601</w:t>
+            </w:r>
           </w:p>
         </w:tc>
       </w:tr>
@@ -7843,6 +7863,14 @@
                 <w:szCs w:val="28"/>
               </w:rPr>
             </w:pPr>
+            <w:r>
+              <w:rPr>
+                <w:rFonts w:ascii="Times New Roman" w:hAnsi="Times New Roman" w:cs="Times New Roman"/>
+                <w:sz w:val="28"/>
+                <w:szCs w:val="28"/>
+              </w:rPr>
+              <w:t>0.1554</w:t>
+            </w:r>
           </w:p>
         </w:tc>
       </w:tr>
@@ -7995,6 +8023,14 @@
                 <w:szCs w:val="28"/>
               </w:rPr>
             </w:pPr>
+            <w:r>
+              <w:rPr>
+                <w:rFonts w:ascii="Times New Roman" w:hAnsi="Times New Roman" w:cs="Times New Roman"/>
+                <w:sz w:val="28"/>
+                <w:szCs w:val="28"/>
+              </w:rPr>
+              <w:t>6.326</w:t>
+            </w:r>
           </w:p>
         </w:tc>
       </w:tr>

</xml_diff>